<commit_message>
feat: hoan thanh chuan hoa tron bo 6 de thi Vat li 10 GHK1 (HBT, BTX, NH, NTT, PDL, QH) chuan Lop Toan Co Thuy
</commit_message>
<xml_diff>
--- a/pdf2word/San_Pham/TN9_Chuong5_Bai17_HDG.docx
+++ b/pdf2word/San_Pham/TN9_Chuong5_Bai17_HDG.docx
@@ -140,14 +140,14 @@
                 <w:b/>
                 <w:sz w:val="21"/>
               </w:rPr>
-              <w:t xml:space="preserve">Tác giả sưu tầm: </w:t>
+              <w:t xml:space="preserve">Môn học: </w:t>
             </w:r>
             <w:r>
               <w:rPr>
                 <w:rFonts w:ascii="Times New Roman" w:hAnsi="Times New Roman"/>
                 <w:sz w:val="21"/>
               </w:rPr>
-              <w:t>Phan Đình Quân</w:t>
+              <w:t>TOÁN 9 (KNTT)</w:t>
             </w:r>
           </w:p>
         </w:tc>

</xml_diff>